<commit_message>
docs: remove internal-source references from to_fi.md gap analysis
Removed mentions of the internal 'to_fi_original_raw.md' working file
and 'Confluence-pasted list' / 'per request' phrasing from the scope
note -- these are session-internal artifacts, not something a reader
of the final deliverable needs or can access. Regenerated PDF/docx.

Co-authored-by: Copilot <223556219+Copilot@users.noreply.github.com>
</commit_message>
<xml_diff>
--- a/whitepaper/to_fi.docx
+++ b/whitepaper/to_fi.docx
@@ -94,7 +94,7 @@
         <w:t xml:space="preserve"> </w:t>
       </w:r>
       <w:r>
-        <w:t xml:space="preserve">scripts are out of scope for this document per request.</w:t>
+        <w:t xml:space="preserve">scripts are out of scope for this document.</w:t>
       </w:r>
     </w:p>
     <w:p>
@@ -102,22 +102,7 @@
         <w:pStyle w:val="BlockText"/>
       </w:pPr>
       <w:r>
-        <w:t xml:space="preserve">Source: original Confluence-pasted list (</w:t>
-      </w:r>
-      <w:r>
-        <w:rPr>
-          <w:rStyle w:val="VerbatimChar"/>
-        </w:rPr>
-        <w:t xml:space="preserve">to_fi_original_raw.md</w:t>
-      </w:r>
-      <w:r>
-        <w:t xml:space="preserve">, table formatting lost — see</w:t>
-      </w:r>
-      <w:r>
-        <w:t xml:space="preserve"> </w:t>
-      </w:r>
-      <w:r>
-        <w:t xml:space="preserve">that file for the raw paste) cross-checked directly against the</w:t>
+        <w:t xml:space="preserve">Cross-checked directly against the</w:t>
       </w:r>
       <w:r>
         <w:t xml:space="preserve"> </w:t>
@@ -132,7 +117,7 @@
         <w:t xml:space="preserve"> </w:t>
       </w:r>
       <w:r>
-        <w:t xml:space="preserve">repo clone at</w:t>
+        <w:t xml:space="preserve">repo at</w:t>
       </w:r>
       <w:r>
         <w:t xml:space="preserve"> </w:t>
@@ -1948,19 +1933,13 @@
         <w:t xml:space="preserve"> </w:t>
       </w:r>
       <w:r>
-        <w:t xml:space="preserve">versions (matching what the repo actually ships for all 8 patterns) and</w:t>
-      </w:r>
-      <w:r>
-        <w:t xml:space="preserve"> </w:t>
-      </w:r>
-      <w:r>
-        <w:t xml:space="preserve">did not previously call out this schema-migration gap — worth a short note there so readers on</w:t>
-      </w:r>
-      <w:r>
-        <w:t xml:space="preserve"> </w:t>
-      </w:r>
-      <w:r>
-        <w:t xml:space="preserve">newer Dynamo Platform versions know</w:t>
+        <w:t xml:space="preserve">versions (matching what the repo actually ships for all 8 patterns).</w:t>
+      </w:r>
+      <w:r>
+        <w:t xml:space="preserve"> </w:t>
+      </w:r>
+      <w:r>
+        <w:t xml:space="preserve">Readers on newer Dynamo Platform versions should note that</w:t>
       </w:r>
       <w:r>
         <w:t xml:space="preserve"> </w:t>
@@ -1975,7 +1954,13 @@
         <w:t xml:space="preserve"> </w:t>
       </w:r>
       <w:r>
-        <w:t xml:space="preserve">XPU coverage is currently partial.</w:t>
+        <w:t xml:space="preserve">XPU coverage is currently</w:t>
+      </w:r>
+      <w:r>
+        <w:t xml:space="preserve"> </w:t>
+      </w:r>
+      <w:r>
+        <w:t xml:space="preserve">partial.</w:t>
       </w:r>
     </w:p>
     <w:p>

</xml_diff>

<commit_message>
docs(whitepaper): tighten dynamo-crds deprecation note, switch PDF pipeline to xelatex
- Simplified the dynamo-crds deprecation note to state current facts
  without referencing 'older instructions'.
- Regenerated PDF using xelatex (TeXLive) instead of weasyprint for
  better Unicode glyph coverage and proper code-block/table wrapping.

Co-authored-by: Copilot <223556219+Copilot@users.noreply.github.com>
</commit_message>
<xml_diff>
--- a/whitepaper/to_fi.docx
+++ b/whitepaper/to_fi.docx
@@ -2,32 +2,6 @@
 <file path=word/document.xml><?xml version="1.0" encoding="utf-8"?>
 <w:document xmlns:w="http://schemas.openxmlformats.org/wordprocessingml/2006/main" xmlns:m="http://schemas.openxmlformats.org/officeDocument/2006/math" xmlns:r="http://schemas.openxmlformats.org/officeDocument/2006/relationships" xmlns:o="urn:schemas-microsoft-com:office:office" xmlns:v="urn:schemas-microsoft-com:vml" xmlns:w10="urn:schemas-microsoft-com:office:word" xmlns:a="http://schemas.openxmlformats.org/drawingml/2006/main" xmlns:pic="http://schemas.openxmlformats.org/drawingml/2006/picture" xmlns:wp="http://schemas.openxmlformats.org/drawingml/2006/wordprocessingDrawing">
   <w:body>
-    <w:sdt>
-      <w:sdtPr>
-        <w:docPartObj>
-          <w:docPartGallery w:val="Table of Contents"/>
-          <w:docPartUnique/>
-        </w:docPartObj>
-      </w:sdtPr>
-      <w:sdtContent>
-        <w:p>
-          <w:pPr>
-            <w:pStyle w:val="TOCHeading"/>
-          </w:pPr>
-          <w:r>
-            <w:t xml:space="preserve">Table of Contents</w:t>
-          </w:r>
-        </w:p>
-        <w:p>
-          <w:r>
-            <w:fldChar w:fldCharType="begin" w:dirty="true"/>
-            <w:instrText xml:space="preserve">TOC \o "1-3" \h \z \u</w:instrText>
-            <w:fldChar w:fldCharType="separate"/>
-            <w:fldChar w:fldCharType="end"/>
-          </w:r>
-        </w:p>
-      </w:sdtContent>
-    </w:sdt>
     <w:bookmarkStart w:id="27" w:name="X3af63aadc00bf665ca9d1cbd1b25f30874ae57f"/>
     <w:p>
       <w:pPr>

</xml_diff>